<commit_message>
Add advisor and update CV
</commit_message>
<xml_diff>
--- a/files/cv/cv.docx
+++ b/files/cv/cv.docx
@@ -86,19 +86,11 @@
             </w:tcMar>
           </w:tcPr>
           <w:p>
-            <w:proofErr w:type="spellStart"/>
             <w:r>
               <w:rPr>
                 <w:color w:val="000000"/>
               </w:rPr>
-              <w:t>Zicklin</w:t>
-            </w:r>
-            <w:proofErr w:type="spellEnd"/>
-            <w:r>
-              <w:rPr>
-                <w:color w:val="000000"/>
-              </w:rPr>
-              <w:t xml:space="preserve"> School of Business</w:t>
+              <w:t>Zicklin School of Business</w:t>
             </w:r>
           </w:p>
           <w:p>
@@ -273,21 +265,7 @@
         <w:rPr>
           <w:color w:val="000000"/>
         </w:rPr>
-        <w:t xml:space="preserve">Graduate Certificate in </w:t>
-      </w:r>
-      <w:proofErr w:type="spellStart"/>
-      <w:r>
-        <w:rPr>
-          <w:color w:val="000000"/>
-        </w:rPr>
-        <w:t>Technopreneurship</w:t>
-      </w:r>
-      <w:proofErr w:type="spellEnd"/>
-      <w:r>
-        <w:rPr>
-          <w:color w:val="000000"/>
-        </w:rPr>
-        <w:t xml:space="preserve"> and Innovation, 2020</w:t>
+        <w:t>Graduate Certificate in Technopreneurship and Innovation, 2020</w:t>
       </w:r>
     </w:p>
     <w:p>
@@ -295,33 +273,11 @@
         <w:pStyle w:val="CVBody"/>
         <w:ind w:left="101"/>
       </w:pPr>
-      <w:proofErr w:type="spellStart"/>
-      <w:r>
-        <w:rPr>
-          <w:color w:val="000000"/>
-        </w:rPr>
-        <w:t>B.Acc</w:t>
-      </w:r>
-      <w:proofErr w:type="spellEnd"/>
-      <w:r>
-        <w:rPr>
-          <w:color w:val="000000"/>
-        </w:rPr>
-        <w:t xml:space="preserve">. in Accountancy (First Class </w:t>
-      </w:r>
-      <w:proofErr w:type="spellStart"/>
-      <w:r>
-        <w:rPr>
-          <w:color w:val="000000"/>
-        </w:rPr>
-        <w:t>Honours</w:t>
-      </w:r>
-      <w:proofErr w:type="spellEnd"/>
-      <w:r>
-        <w:rPr>
-          <w:color w:val="000000"/>
-        </w:rPr>
-        <w:t>), 2019</w:t>
+      <w:r>
+        <w:rPr>
+          <w:color w:val="000000"/>
+        </w:rPr>
+        <w:t>B.Acc. in Accountancy (First Class Honours), 2019</w:t>
       </w:r>
     </w:p>
     <w:p>
@@ -329,7 +285,6 @@
         <w:pStyle w:val="CVBody"/>
         <w:ind w:left="101"/>
       </w:pPr>
-      <w:proofErr w:type="spellStart"/>
       <w:r>
         <w:rPr>
           <w:color w:val="000000"/>
@@ -342,26 +297,11 @@
         </w:rPr>
         <w:t>Bus</w:t>
       </w:r>
-      <w:proofErr w:type="spellEnd"/>
-      <w:r>
-        <w:rPr>
-          <w:color w:val="000000"/>
-        </w:rPr>
-        <w:t xml:space="preserve">. in Business Analytics (First Class </w:t>
-      </w:r>
-      <w:proofErr w:type="spellStart"/>
-      <w:r>
-        <w:rPr>
-          <w:color w:val="000000"/>
-        </w:rPr>
-        <w:t>Honours</w:t>
-      </w:r>
-      <w:proofErr w:type="spellEnd"/>
-      <w:r>
-        <w:rPr>
-          <w:color w:val="000000"/>
-        </w:rPr>
-        <w:t>), 2019</w:t>
+      <w:r>
+        <w:rPr>
+          <w:color w:val="000000"/>
+        </w:rPr>
+        <w:t>. in Business Analytics (First Class Honours), 2019</w:t>
       </w:r>
     </w:p>
     <w:p>
@@ -424,13 +364,7 @@
         <w:rPr>
           <w:color w:val="000000"/>
         </w:rPr>
-        <w:t>financial market manipulation</w:t>
-      </w:r>
-      <w:r>
-        <w:rPr>
-          <w:color w:val="000000"/>
-        </w:rPr>
-        <w:t xml:space="preserve"> ; </w:t>
+        <w:t xml:space="preserve">financial market manipulation ; </w:t>
       </w:r>
       <w:r>
         <w:rPr>
@@ -526,21 +460,7 @@
         <w:rPr>
           <w:color w:val="000000"/>
         </w:rPr>
-        <w:t xml:space="preserve">Edward Li, Lin Peng, Michael Grossman, </w:t>
-      </w:r>
-      <w:proofErr w:type="spellStart"/>
-      <w:r>
-        <w:rPr>
-          <w:color w:val="000000"/>
-        </w:rPr>
-        <w:t>Hagit</w:t>
-      </w:r>
-      <w:proofErr w:type="spellEnd"/>
-      <w:r>
-        <w:rPr>
-          <w:color w:val="000000"/>
-        </w:rPr>
-        <w:t xml:space="preserve"> Levy, Diana Weng</w:t>
+        <w:t>Edward Li, Lin Peng, Michael Grossman, Hagit Levy, Diana Weng</w:t>
       </w:r>
     </w:p>
     <w:p>
@@ -589,6 +509,7 @@
       <w:pPr>
         <w:pStyle w:val="CVBody"/>
         <w:spacing w:after="20"/>
+        <w:ind w:left="720" w:hanging="720"/>
       </w:pPr>
       <w:r>
         <w:rPr>
@@ -613,14 +534,108 @@
           <w:color w:val="000000"/>
         </w:rPr>
         <w:tab/>
-        <w:t xml:space="preserve">“Information or Institution? AI’s Role in Expert Testimony” with </w:t>
+      </w:r>
+      <w:r>
+        <w:rPr>
+          <w:color w:val="000000"/>
+        </w:rPr>
+        <w:t xml:space="preserve">“Election Prediction Markets: Evidence from Polymarket, Kalshi, and Robinhood” with </w:t>
       </w:r>
       <w:r>
         <w:rPr>
           <w:i/>
           <w:color w:val="000000"/>
         </w:rPr>
-        <w:t>Shou-Ming Chang</w:t>
+        <w:t>Lin Peng, Dexin Zhou, and Yubo Tao</w:t>
+      </w:r>
+    </w:p>
+    <w:p>
+      <w:pPr>
+        <w:pStyle w:val="CVBullet"/>
+        <w:spacing w:after="20"/>
+        <w:ind w:left="921" w:hanging="259"/>
+        <w:rPr>
+          <w:color w:val="000000"/>
+        </w:rPr>
+      </w:pPr>
+      <w:r>
+        <w:rPr>
+          <w:color w:val="000000"/>
+        </w:rPr>
+        <w:t>-  Presented at Baruch College, CUFE, PKU-NSD, Fudan University, Hong Kong Polytechnic University, University of Macau, Lancaster University, and the University of South Carolina.</w:t>
+      </w:r>
+    </w:p>
+    <w:p>
+      <w:pPr>
+        <w:pStyle w:val="CVBullet"/>
+        <w:spacing w:after="20"/>
+        <w:ind w:left="921" w:hanging="259"/>
+        <w:rPr>
+          <w:color w:val="000000"/>
+        </w:rPr>
+      </w:pPr>
+      <w:r>
+        <w:rPr>
+          <w:color w:val="000000"/>
+        </w:rPr>
+        <w:t xml:space="preserve">- Under review at </w:t>
+      </w:r>
+      <w:r>
+        <w:rPr>
+          <w:i/>
+          <w:iCs/>
+          <w:color w:val="000000"/>
+        </w:rPr>
+        <w:t>Journal of Financial Quantitative Analysis</w:t>
+      </w:r>
+    </w:p>
+    <w:p>
+      <w:pPr>
+        <w:pStyle w:val="CVBullet"/>
+        <w:spacing w:after="20"/>
+      </w:pPr>
+    </w:p>
+    <w:p>
+      <w:pPr>
+        <w:pStyle w:val="CVBody"/>
+        <w:spacing w:after="20"/>
+      </w:pPr>
+      <w:r>
+        <w:rPr>
+          <w:color w:val="000000"/>
+        </w:rPr>
+        <w:t>[</w:t>
+      </w:r>
+      <w:r>
+        <w:rPr>
+          <w:color w:val="000000"/>
+        </w:rPr>
+        <w:t>3</w:t>
+      </w:r>
+      <w:r>
+        <w:rPr>
+          <w:color w:val="000000"/>
+        </w:rPr>
+        <w:t xml:space="preserve">] </w:t>
+      </w:r>
+      <w:r>
+        <w:rPr>
+          <w:color w:val="000000"/>
+        </w:rPr>
+        <w:tab/>
+        <w:t>“</w:t>
+      </w:r>
+      <w:r>
+        <w:rPr>
+          <w:color w:val="000000"/>
+        </w:rPr>
+        <w:t>Outsourced Cryptocurrency Wash Trading</w:t>
+      </w:r>
+      <w:r>
+        <w:rPr>
+          <w:color w:val="000000"/>
+        </w:rPr>
+        <w:t>” (solo-authored)</w:t>
       </w:r>
     </w:p>
     <w:p>
@@ -636,6 +651,66 @@
         <w:rPr>
           <w:color w:val="000000"/>
         </w:rPr>
+        <w:t>-  Presented at the Baruch-SWUFE Research Symposium, 2025.</w:t>
+      </w:r>
+    </w:p>
+    <w:p>
+      <w:pPr>
+        <w:pStyle w:val="CVBullet"/>
+        <w:spacing w:after="20"/>
+      </w:pPr>
+    </w:p>
+    <w:p>
+      <w:pPr>
+        <w:pStyle w:val="CVBody"/>
+        <w:spacing w:after="20"/>
+      </w:pPr>
+      <w:r>
+        <w:rPr>
+          <w:color w:val="000000"/>
+        </w:rPr>
+        <w:t>[</w:t>
+      </w:r>
+      <w:r>
+        <w:rPr>
+          <w:color w:val="000000"/>
+        </w:rPr>
+        <w:t>4</w:t>
+      </w:r>
+      <w:r>
+        <w:rPr>
+          <w:color w:val="000000"/>
+        </w:rPr>
+        <w:t xml:space="preserve">] </w:t>
+      </w:r>
+      <w:r>
+        <w:rPr>
+          <w:color w:val="000000"/>
+        </w:rPr>
+        <w:tab/>
+        <w:t xml:space="preserve">“Information or Institution? AI’s Role in Expert Testimony” with </w:t>
+      </w:r>
+      <w:r>
+        <w:rPr>
+          <w:i/>
+          <w:color w:val="000000"/>
+        </w:rPr>
+        <w:t>Shou-Ming Chang</w:t>
+      </w:r>
+    </w:p>
+    <w:p>
+      <w:pPr>
+        <w:pStyle w:val="CVBullet"/>
+        <w:spacing w:after="20"/>
+        <w:ind w:left="403" w:firstLine="317"/>
+        <w:rPr>
+          <w:color w:val="000000"/>
+        </w:rPr>
+      </w:pPr>
+      <w:r>
+        <w:rPr>
+          <w:color w:val="000000"/>
+        </w:rPr>
         <w:t>-  Presented at the Sovereign AI Workshop (HCOMP 2026) and the CUNY Graduate Center, 2026.</w:t>
       </w:r>
     </w:p>
@@ -665,8 +740,9 @@
     </w:p>
     <w:p>
       <w:pPr>
-        <w:pStyle w:val="CVBody"/>
+        <w:pStyle w:val="CVBullet"/>
         <w:spacing w:after="20"/>
+        <w:ind w:left="403" w:hanging="259"/>
       </w:pPr>
     </w:p>
     <w:p>
@@ -674,24 +750,16 @@
         <w:pStyle w:val="CVBody"/>
         <w:spacing w:after="20"/>
         <w:ind w:left="720" w:hanging="720"/>
-      </w:pPr>
-      <w:r>
-        <w:rPr>
-          <w:color w:val="000000"/>
-        </w:rPr>
-        <w:t>[</w:t>
-      </w:r>
-      <w:r>
-        <w:rPr>
-          <w:color w:val="000000"/>
-        </w:rPr>
-        <w:t>3</w:t>
-      </w:r>
-      <w:r>
-        <w:rPr>
-          <w:color w:val="000000"/>
-        </w:rPr>
-        <w:t xml:space="preserve">] </w:t>
+        <w:rPr>
+          <w:i/>
+          <w:color w:val="000000"/>
+        </w:rPr>
+      </w:pPr>
+      <w:r>
+        <w:rPr>
+          <w:color w:val="000000"/>
+        </w:rPr>
+        <w:t xml:space="preserve">[5] </w:t>
       </w:r>
       <w:r>
         <w:rPr>
@@ -703,174 +771,40 @@
         <w:rPr>
           <w:color w:val="000000"/>
         </w:rPr>
-        <w:t xml:space="preserve">“Election Prediction Markets: Evidence from </w:t>
-      </w:r>
-      <w:proofErr w:type="spellStart"/>
-      <w:r>
-        <w:rPr>
-          <w:color w:val="000000"/>
-        </w:rPr>
-        <w:t>Polymarket</w:t>
-      </w:r>
-      <w:proofErr w:type="spellEnd"/>
-      <w:r>
-        <w:rPr>
-          <w:color w:val="000000"/>
-        </w:rPr>
-        <w:t xml:space="preserve">, </w:t>
-      </w:r>
-      <w:proofErr w:type="spellStart"/>
-      <w:r>
-        <w:rPr>
-          <w:color w:val="000000"/>
-        </w:rPr>
-        <w:t>Kalshi</w:t>
-      </w:r>
-      <w:proofErr w:type="spellEnd"/>
-      <w:r>
-        <w:rPr>
-          <w:color w:val="000000"/>
-        </w:rPr>
-        <w:t xml:space="preserve">, and Robinhood” with </w:t>
+        <w:t xml:space="preserve">“Using a Sandboxed Ticketing Bot to Teach Digital Trust and IT Audit” with </w:t>
       </w:r>
       <w:r>
         <w:rPr>
           <w:i/>
           <w:color w:val="000000"/>
         </w:rPr>
-        <w:t xml:space="preserve">Lin Peng, </w:t>
-      </w:r>
-      <w:proofErr w:type="spellStart"/>
-      <w:r>
-        <w:rPr>
-          <w:i/>
-          <w:color w:val="000000"/>
-        </w:rPr>
-        <w:t>Dexin</w:t>
-      </w:r>
-      <w:proofErr w:type="spellEnd"/>
-      <w:r>
-        <w:rPr>
-          <w:i/>
-          <w:color w:val="000000"/>
-        </w:rPr>
-        <w:t xml:space="preserve"> Zhou, and </w:t>
-      </w:r>
-      <w:proofErr w:type="spellStart"/>
-      <w:r>
-        <w:rPr>
-          <w:i/>
-          <w:color w:val="000000"/>
-        </w:rPr>
-        <w:t>Yubo</w:t>
-      </w:r>
-      <w:proofErr w:type="spellEnd"/>
-      <w:r>
-        <w:rPr>
-          <w:i/>
-          <w:color w:val="000000"/>
-        </w:rPr>
-        <w:t xml:space="preserve"> Tao</w:t>
+        <w:t>Lorraine Lee, Hagit Levy-Shalev, and Shantel Deleon</w:t>
       </w:r>
     </w:p>
     <w:p>
       <w:pPr>
-        <w:pStyle w:val="CVBullet"/>
-        <w:spacing w:after="20"/>
-        <w:ind w:left="921" w:hanging="259"/>
-        <w:rPr>
-          <w:color w:val="000000"/>
-        </w:rPr>
-      </w:pPr>
-      <w:r>
-        <w:rPr>
-          <w:color w:val="000000"/>
-        </w:rPr>
-        <w:t>-  Presented at Baruch College, CUFE, PKU-NSD, Fudan University, Hong Kong Polytechnic University, University of Macau, Lancaster University, and the University of South Carolina.</w:t>
-      </w:r>
-    </w:p>
-    <w:p>
-      <w:pPr>
-        <w:pStyle w:val="CVBullet"/>
-        <w:spacing w:after="20"/>
-        <w:ind w:left="921" w:hanging="259"/>
-        <w:rPr>
-          <w:color w:val="000000"/>
-        </w:rPr>
-      </w:pPr>
-      <w:r>
-        <w:rPr>
-          <w:color w:val="000000"/>
-        </w:rPr>
-        <w:t xml:space="preserve">- Under review at </w:t>
-      </w:r>
-      <w:r>
-        <w:rPr>
-          <w:i/>
-          <w:iCs/>
-          <w:color w:val="000000"/>
-        </w:rPr>
-        <w:t>Journal of Financial Quantitative Analysis</w:t>
-      </w:r>
-    </w:p>
-    <w:p>
-      <w:pPr>
-        <w:pStyle w:val="CVBullet"/>
-        <w:spacing w:after="20"/>
-      </w:pPr>
-    </w:p>
-    <w:p>
-      <w:pPr>
         <w:pStyle w:val="CVBody"/>
         <w:spacing w:after="20"/>
-      </w:pPr>
-      <w:r>
-        <w:rPr>
-          <w:color w:val="000000"/>
-        </w:rPr>
-        <w:t>[</w:t>
-      </w:r>
-      <w:r>
-        <w:rPr>
-          <w:color w:val="000000"/>
-        </w:rPr>
-        <w:t>4</w:t>
-      </w:r>
-      <w:r>
-        <w:rPr>
-          <w:color w:val="000000"/>
-        </w:rPr>
-        <w:t xml:space="preserve">] </w:t>
-      </w:r>
-      <w:r>
-        <w:rPr>
-          <w:color w:val="000000"/>
-        </w:rPr>
-        <w:tab/>
-      </w:r>
-      <w:r>
-        <w:rPr>
-          <w:color w:val="000000"/>
-        </w:rPr>
-        <w:t>“</w:t>
-      </w:r>
-      <w:r>
-        <w:rPr>
-          <w:color w:val="000000"/>
-        </w:rPr>
-        <w:t>Outsourced Cryptocurrency Wash Trading</w:t>
-      </w:r>
-      <w:r>
-        <w:rPr>
-          <w:color w:val="000000"/>
-        </w:rPr>
-        <w:t>”</w:t>
-      </w:r>
-      <w:r>
-        <w:rPr>
-          <w:color w:val="000000"/>
-        </w:rPr>
-        <w:t xml:space="preserve"> (solo-authored)</w:t>
+        <w:ind w:left="720"/>
+      </w:pPr>
+      <w:r>
+        <w:rPr>
+          <w:color w:val="000000"/>
+        </w:rPr>
+        <w:t>-  To present at 17</w:t>
+      </w:r>
+      <w:r>
+        <w:rPr>
+          <w:color w:val="000000"/>
+          <w:vertAlign w:val="superscript"/>
+        </w:rPr>
+        <w:t>th</w:t>
+      </w:r>
+      <w:r>
+        <w:rPr>
+          <w:color w:val="000000"/>
+        </w:rPr>
+        <w:t xml:space="preserve"> Annual Pre-ICIS Workshop on Accounting Information Systems (SIG-ASYS 2026) </w:t>
       </w:r>
     </w:p>
     <w:p>
@@ -878,15 +812,67 @@
         <w:pStyle w:val="CVBullet"/>
         <w:spacing w:after="20"/>
         <w:ind w:left="403" w:firstLine="317"/>
-        <w:rPr>
-          <w:color w:val="000000"/>
-        </w:rPr>
-      </w:pPr>
-      <w:r>
-        <w:rPr>
-          <w:color w:val="000000"/>
-        </w:rPr>
-        <w:t>-  Presented at the Baruch-SWUFE Research Symposium, 2025.</w:t>
+      </w:pPr>
+      <w:r>
+        <w:rPr>
+          <w:color w:val="000000"/>
+        </w:rPr>
+        <w:t xml:space="preserve">-  </w:t>
+      </w:r>
+      <w:r>
+        <w:rPr>
+          <w:color w:val="000000"/>
+        </w:rPr>
+        <w:t xml:space="preserve">Under review at </w:t>
+      </w:r>
+      <w:r>
+        <w:rPr>
+          <w:i/>
+          <w:iCs/>
+          <w:color w:val="000000"/>
+        </w:rPr>
+        <w:t>Issues in Accounting Education.</w:t>
+      </w:r>
+    </w:p>
+    <w:p>
+      <w:pPr>
+        <w:pStyle w:val="CVBody"/>
+        <w:spacing w:after="20"/>
+        <w:rPr>
+          <w:color w:val="000000"/>
+        </w:rPr>
+      </w:pPr>
+    </w:p>
+    <w:p>
+      <w:pPr>
+        <w:pStyle w:val="CVBody"/>
+        <w:spacing w:after="20"/>
+        <w:ind w:left="720" w:hanging="720"/>
+      </w:pPr>
+      <w:r>
+        <w:rPr>
+          <w:color w:val="000000"/>
+        </w:rPr>
+        <w:t xml:space="preserve">[6] </w:t>
+      </w:r>
+      <w:r>
+        <w:rPr>
+          <w:color w:val="000000"/>
+        </w:rPr>
+        <w:tab/>
+      </w:r>
+      <w:r>
+        <w:rPr>
+          <w:color w:val="000000"/>
+        </w:rPr>
+        <w:t xml:space="preserve">“Scalable Data Analytics Pedagogy in Accounting: Randomized Case Studies and Automated Assessment” with </w:t>
+      </w:r>
+      <w:r>
+        <w:rPr>
+          <w:i/>
+          <w:color w:val="000000"/>
+        </w:rPr>
+        <w:t>Hagit Levy-Shalev and Carol Marquardt</w:t>
       </w:r>
     </w:p>
     <w:p>
@@ -895,210 +881,16 @@
         <w:spacing w:after="20"/>
         <w:ind w:left="403" w:firstLine="317"/>
         <w:rPr>
-          <w:color w:val="000000"/>
-        </w:rPr>
-      </w:pPr>
-      <w:r>
-        <w:rPr>
-          <w:color w:val="000000"/>
-        </w:rPr>
-        <w:t xml:space="preserve">- Under review at </w:t>
-      </w:r>
-      <w:r>
-        <w:rPr>
           <w:i/>
           <w:iCs/>
           <w:color w:val="000000"/>
         </w:rPr>
-        <w:t>Management Science</w:t>
-      </w:r>
-      <w:r>
-        <w:rPr>
-          <w:i/>
-          <w:iCs/>
-          <w:color w:val="000000"/>
-        </w:rPr>
-        <w:t>.</w:t>
-      </w:r>
-    </w:p>
-    <w:p>
-      <w:pPr>
-        <w:pStyle w:val="CVBullet"/>
-        <w:spacing w:after="20"/>
-        <w:ind w:left="403" w:hanging="259"/>
-      </w:pPr>
-    </w:p>
-    <w:p>
-      <w:pPr>
-        <w:pStyle w:val="CVBody"/>
-        <w:spacing w:after="20"/>
-        <w:ind w:left="720" w:hanging="720"/>
-        <w:rPr>
-          <w:i/>
-          <w:color w:val="000000"/>
-        </w:rPr>
-      </w:pPr>
-      <w:r>
-        <w:rPr>
-          <w:color w:val="000000"/>
-        </w:rPr>
-        <w:t xml:space="preserve">[5] </w:t>
-      </w:r>
-      <w:r>
-        <w:rPr>
-          <w:color w:val="000000"/>
-        </w:rPr>
-        <w:tab/>
-      </w:r>
-      <w:r>
-        <w:rPr>
-          <w:color w:val="000000"/>
-        </w:rPr>
-        <w:t xml:space="preserve">“Using a Sandboxed Ticketing Bot to Teach Digital Trust and IT Audit” with </w:t>
-      </w:r>
-      <w:r>
-        <w:rPr>
-          <w:i/>
-          <w:color w:val="000000"/>
-        </w:rPr>
-        <w:t xml:space="preserve">Lorraine Lee, </w:t>
-      </w:r>
-      <w:proofErr w:type="spellStart"/>
-      <w:r>
-        <w:rPr>
-          <w:i/>
-          <w:color w:val="000000"/>
-        </w:rPr>
-        <w:t>Hagit</w:t>
-      </w:r>
-      <w:proofErr w:type="spellEnd"/>
-      <w:r>
-        <w:rPr>
-          <w:i/>
-          <w:color w:val="000000"/>
-        </w:rPr>
-        <w:t xml:space="preserve"> Levy-Shalev, and Shantel Deleon</w:t>
-      </w:r>
-    </w:p>
-    <w:p>
-      <w:pPr>
-        <w:pStyle w:val="CVBody"/>
-        <w:spacing w:after="20"/>
-        <w:ind w:left="720"/>
-      </w:pPr>
-      <w:r>
-        <w:rPr>
-          <w:color w:val="000000"/>
-        </w:rPr>
-        <w:t>-  To present at 17</w:t>
-      </w:r>
-      <w:r>
-        <w:rPr>
-          <w:color w:val="000000"/>
-          <w:vertAlign w:val="superscript"/>
-        </w:rPr>
-        <w:t>th</w:t>
-      </w:r>
-      <w:r>
-        <w:rPr>
-          <w:color w:val="000000"/>
-        </w:rPr>
-        <w:t xml:space="preserve"> Annual Pre-ICIS Workshop on Accounting Information Systems (SIG-ASYS 2026) </w:t>
-      </w:r>
-    </w:p>
-    <w:p>
-      <w:pPr>
-        <w:pStyle w:val="CVBullet"/>
-        <w:spacing w:after="20"/>
-        <w:ind w:left="403" w:firstLine="317"/>
-      </w:pPr>
-      <w:r>
-        <w:rPr>
-          <w:color w:val="000000"/>
-        </w:rPr>
-        <w:t xml:space="preserve">-  </w:t>
-      </w:r>
-      <w:r>
-        <w:rPr>
-          <w:color w:val="000000"/>
-        </w:rPr>
-        <w:t xml:space="preserve">Under review at </w:t>
-      </w:r>
-      <w:r>
-        <w:rPr>
-          <w:i/>
-          <w:iCs/>
-          <w:color w:val="000000"/>
-        </w:rPr>
-        <w:t>Issues in Accounting Education.</w:t>
-      </w:r>
-    </w:p>
-    <w:p>
-      <w:pPr>
-        <w:pStyle w:val="CVBody"/>
-        <w:spacing w:after="20"/>
-        <w:rPr>
-          <w:color w:val="000000"/>
-        </w:rPr>
-      </w:pPr>
-    </w:p>
-    <w:p>
-      <w:pPr>
-        <w:pStyle w:val="CVBody"/>
-        <w:spacing w:after="20"/>
-        <w:ind w:left="720" w:hanging="720"/>
       </w:pPr>
       <w:r>
         <w:rPr>
           <w:color w:val="000000"/>
         </w:rPr>
         <w:lastRenderedPageBreak/>
-        <w:t xml:space="preserve">[6] </w:t>
-      </w:r>
-      <w:r>
-        <w:rPr>
-          <w:color w:val="000000"/>
-        </w:rPr>
-        <w:tab/>
-      </w:r>
-      <w:r>
-        <w:rPr>
-          <w:color w:val="000000"/>
-        </w:rPr>
-        <w:t xml:space="preserve">“Scalable Data Analytics Pedagogy in Accounting: Randomized Case Studies and Automated Assessment” with </w:t>
-      </w:r>
-      <w:proofErr w:type="spellStart"/>
-      <w:r>
-        <w:rPr>
-          <w:i/>
-          <w:color w:val="000000"/>
-        </w:rPr>
-        <w:t>Hagit</w:t>
-      </w:r>
-      <w:proofErr w:type="spellEnd"/>
-      <w:r>
-        <w:rPr>
-          <w:i/>
-          <w:color w:val="000000"/>
-        </w:rPr>
-        <w:t xml:space="preserve"> Levy-Shalev and Carol Marquardt</w:t>
-      </w:r>
-    </w:p>
-    <w:p>
-      <w:pPr>
-        <w:pStyle w:val="CVBullet"/>
-        <w:spacing w:after="20"/>
-        <w:ind w:left="403" w:firstLine="317"/>
-        <w:rPr>
-          <w:i/>
-          <w:iCs/>
-          <w:color w:val="000000"/>
-        </w:rPr>
-      </w:pPr>
-      <w:r>
-        <w:rPr>
-          <w:color w:val="000000"/>
-        </w:rPr>
         <w:t xml:space="preserve">-  </w:t>
       </w:r>
       <w:r>
@@ -1242,23 +1034,7 @@
           <w:b/>
           <w:color w:val="000000"/>
         </w:rPr>
-        <w:t xml:space="preserve">Baruch College - </w:t>
-      </w:r>
-      <w:proofErr w:type="spellStart"/>
-      <w:r>
-        <w:rPr>
-          <w:b/>
-          <w:color w:val="000000"/>
-        </w:rPr>
-        <w:t>Zicklin</w:t>
-      </w:r>
-      <w:proofErr w:type="spellEnd"/>
-      <w:r>
-        <w:rPr>
-          <w:b/>
-          <w:color w:val="000000"/>
-        </w:rPr>
-        <w:t xml:space="preserve"> School of Business</w:t>
+        <w:t>Baruch College - Zicklin School of Business</w:t>
       </w:r>
       <w:r>
         <w:rPr>
@@ -1313,21 +1089,7 @@
         <w:rPr>
           <w:color w:val="000000"/>
         </w:rPr>
-        <w:t xml:space="preserve">-  Recipient of the 2025/2026 </w:t>
-      </w:r>
-      <w:proofErr w:type="spellStart"/>
-      <w:r>
-        <w:rPr>
-          <w:color w:val="000000"/>
-        </w:rPr>
-        <w:t>Zicklin</w:t>
-      </w:r>
-      <w:proofErr w:type="spellEnd"/>
-      <w:r>
-        <w:rPr>
-          <w:color w:val="000000"/>
-        </w:rPr>
-        <w:t xml:space="preserve"> Dean’s Teaching Award.</w:t>
+        <w:t>-  Recipient of the 2025/2026 Zicklin Dean’s Teaching Award.</w:t>
       </w:r>
     </w:p>
     <w:p>
@@ -1394,23 +1156,7 @@
           <w:b/>
           <w:color w:val="000000"/>
         </w:rPr>
-        <w:t xml:space="preserve">Baruch College - </w:t>
-      </w:r>
-      <w:proofErr w:type="spellStart"/>
-      <w:r>
-        <w:rPr>
-          <w:b/>
-          <w:color w:val="000000"/>
-        </w:rPr>
-        <w:t>Marxe</w:t>
-      </w:r>
-      <w:proofErr w:type="spellEnd"/>
-      <w:r>
-        <w:rPr>
-          <w:b/>
-          <w:color w:val="000000"/>
-        </w:rPr>
-        <w:t xml:space="preserve"> School of Public and International Affairs</w:t>
+        <w:t>Baruch College - Marxe School of Public and International Affairs</w:t>
       </w:r>
       <w:r>
         <w:rPr>
@@ -1596,23 +1342,7 @@
           <w:color w:val="000000"/>
           <w:sz w:val="19"/>
         </w:rPr>
-        <w:t xml:space="preserve">Hawaii Accounting Research Doctoral Institute (presenter); Baruch-SWUFE Research Symposium (presenter); Baruch PhD Research Day in Finance (presenter); Baruch Finance Brownbag (presenter); Baruch-JFQA Climate Finance and Sustainability Conference; Baruch-Fordham-Rutgers </w:t>
-      </w:r>
-      <w:proofErr w:type="spellStart"/>
-      <w:r>
-        <w:rPr>
-          <w:color w:val="000000"/>
-          <w:sz w:val="19"/>
-        </w:rPr>
-        <w:t>Trischool</w:t>
-      </w:r>
-      <w:proofErr w:type="spellEnd"/>
-      <w:r>
-        <w:rPr>
-          <w:color w:val="000000"/>
-          <w:sz w:val="19"/>
-        </w:rPr>
-        <w:t xml:space="preserve"> Conference.</w:t>
+        <w:t>Hawaii Accounting Research Doctoral Institute (presenter); Baruch-SWUFE Research Symposium (presenter); Baruch PhD Research Day in Finance (presenter); Baruch Finance Brownbag (presenter); Baruch-JFQA Climate Finance and Sustainability Conference; Baruch-Fordham-Rutgers Trischool Conference.</w:t>
       </w:r>
     </w:p>
     <w:p>
@@ -1756,19 +1486,11 @@
         <w:pStyle w:val="CVBody"/>
         <w:ind w:left="101"/>
       </w:pPr>
-      <w:proofErr w:type="spellStart"/>
-      <w:r>
-        <w:rPr>
-          <w:color w:val="000000"/>
-        </w:rPr>
-        <w:t>Zicklin</w:t>
-      </w:r>
-      <w:proofErr w:type="spellEnd"/>
-      <w:r>
-        <w:rPr>
-          <w:color w:val="000000"/>
-        </w:rPr>
-        <w:t xml:space="preserve"> Dean’s Teaching Award, 2025/2026</w:t>
+      <w:r>
+        <w:rPr>
+          <w:color w:val="000000"/>
+        </w:rPr>
+        <w:t>Zicklin Dean’s Teaching Award, 2025/2026</w:t>
       </w:r>
     </w:p>
     <w:p>
@@ -1792,21 +1514,7 @@
         <w:rPr>
           <w:color w:val="000000"/>
         </w:rPr>
-        <w:t xml:space="preserve">Donald </w:t>
-      </w:r>
-      <w:proofErr w:type="spellStart"/>
-      <w:r>
-        <w:rPr>
-          <w:color w:val="000000"/>
-        </w:rPr>
-        <w:t>Vredenburgh</w:t>
-      </w:r>
-      <w:proofErr w:type="spellEnd"/>
-      <w:r>
-        <w:rPr>
-          <w:color w:val="000000"/>
-        </w:rPr>
-        <w:t xml:space="preserve"> Research Grant, 2025</w:t>
+        <w:t>Donald Vredenburgh Research Grant, 2025</w:t>
       </w:r>
     </w:p>
     <w:p>
@@ -1899,21 +1607,7 @@
         <w:rPr>
           <w:color w:val="000000"/>
         </w:rPr>
-        <w:t xml:space="preserve">-  Worked on fintech and distributed-ledger initiatives, including Project </w:t>
-      </w:r>
-      <w:proofErr w:type="spellStart"/>
-      <w:r>
-        <w:rPr>
-          <w:color w:val="000000"/>
-        </w:rPr>
-        <w:t>Ubin</w:t>
-      </w:r>
-      <w:proofErr w:type="spellEnd"/>
-      <w:r>
-        <w:rPr>
-          <w:color w:val="000000"/>
-        </w:rPr>
-        <w:t>.</w:t>
+        <w:t>-  Worked on fintech and distributed-ledger initiatives, including Project Ubin.</w:t>
       </w:r>
     </w:p>
     <w:p>
@@ -2041,21 +1735,12 @@
                 <w:color w:val="000000"/>
               </w:rPr>
             </w:pPr>
-            <w:proofErr w:type="spellStart"/>
             <w:r>
               <w:rPr>
                 <w:b/>
                 <w:color w:val="000000"/>
               </w:rPr>
-              <w:t>Hagit</w:t>
-            </w:r>
-            <w:proofErr w:type="spellEnd"/>
-            <w:r>
-              <w:rPr>
-                <w:b/>
-                <w:color w:val="000000"/>
-              </w:rPr>
-              <w:t xml:space="preserve"> Levy-Shalev</w:t>
+              <w:t>Hagit Levy-Shalev</w:t>
             </w:r>
           </w:p>
           <w:p>
@@ -2215,25 +1900,6 @@
               <w:t>Email: ayhtong@ntu.edu.sg</w:t>
             </w:r>
           </w:p>
-        </w:tc>
-      </w:tr>
-      <w:tr>
-        <w:trPr>
-          <w:gridAfter w:val="1"/>
-          <w:wAfter w:w="5083" w:type="dxa"/>
-          <w:jc w:val="center"/>
-        </w:trPr>
-        <w:tc>
-          <w:tcPr>
-            <w:tcW w:w="5083" w:type="dxa"/>
-            <w:tcMar>
-              <w:top w:w="0" w:type="dxa"/>
-              <w:left w:w="80" w:type="dxa"/>
-              <w:bottom w:w="100" w:type="dxa"/>
-              <w:right w:w="80" w:type="dxa"/>
-            </w:tcMar>
-          </w:tcPr>
-          <w:p/>
         </w:tc>
       </w:tr>
     </w:tbl>

</xml_diff>